<commit_message>
almost finished off the pdf and fixed the main to be dynamic
</commit_message>
<xml_diff>
--- a/Cos214_Prac4.docx
+++ b/Cos214_Prac4.docx
@@ -4,17 +4,14 @@
   <w:body>
     <w:p>
       <w:pPr>
-        <w:rPr>
-          <w:rFonts w:ascii="Arial" w:hAnsi="Arial" w:cs="Arial"/>
-          <w:color w:val="000000" w:themeColor="text1"/>
+        <w:pStyle w:val="Heading1"/>
+        <w:rPr>
           <w:lang w:val="en-US"/>
         </w:rPr>
       </w:pPr>
       <w:proofErr w:type="spellStart"/>
       <w:r>
         <w:rPr>
-          <w:rFonts w:ascii="Arial" w:hAnsi="Arial" w:cs="Arial"/>
-          <w:color w:val="000000" w:themeColor="text1"/>
           <w:lang w:val="en-US"/>
         </w:rPr>
         <w:t>Prac</w:t>
@@ -22,8 +19,6 @@
       <w:proofErr w:type="spellEnd"/>
       <w:r>
         <w:rPr>
-          <w:rFonts w:ascii="Arial" w:hAnsi="Arial" w:cs="Arial"/>
-          <w:color w:val="000000" w:themeColor="text1"/>
           <w:lang w:val="en-US"/>
         </w:rPr>
         <w:t xml:space="preserve"> 4:</w:t>
@@ -32,15 +27,50 @@
     <w:p>
       <w:pPr>
         <w:rPr>
-          <w:rFonts w:ascii="Arial" w:hAnsi="Arial" w:cs="Arial"/>
-          <w:color w:val="000000" w:themeColor="text1"/>
           <w:lang w:val="en-US"/>
         </w:rPr>
       </w:pPr>
       <w:r>
         <w:rPr>
-          <w:rFonts w:ascii="Arial" w:hAnsi="Arial" w:cs="Arial"/>
-          <w:color w:val="000000" w:themeColor="text1"/>
+          <w:lang w:val="en-US"/>
+        </w:rPr>
+        <w:t>U25044215 – Hannah Diedrick</w:t>
+      </w:r>
+    </w:p>
+    <w:p>
+      <w:pPr>
+        <w:rPr>
+          <w:lang w:val="en-US"/>
+        </w:rPr>
+      </w:pPr>
+      <w:r>
+        <w:rPr>
+          <w:lang w:val="en-US"/>
+        </w:rPr>
+        <w:t>U25328986 – Michael Harding</w:t>
+      </w:r>
+    </w:p>
+    <w:p>
+      <w:pPr>
+        <w:rPr>
+          <w:lang w:val="en-US"/>
+        </w:rPr>
+      </w:pPr>
+    </w:p>
+    <w:p>
+      <w:pPr>
+        <w:rPr>
+          <w:rFonts w:ascii="Arial" w:hAnsi="Arial" w:cs="Arial"/>
+          <w:color w:val="000000" w:themeColor="text1"/>
+          <w:u w:val="single"/>
+          <w:lang w:val="en-US"/>
+        </w:rPr>
+      </w:pPr>
+      <w:r>
+        <w:rPr>
+          <w:rFonts w:ascii="Arial" w:hAnsi="Arial" w:cs="Arial"/>
+          <w:color w:val="000000" w:themeColor="text1"/>
+          <w:u w:val="single"/>
           <w:lang w:val="en-US"/>
         </w:rPr>
         <w:t>Task 1:</w:t>
@@ -2351,7 +2381,6 @@
           <w:color w:val="000000" w:themeColor="text1"/>
           <w:lang w:val="en-US"/>
         </w:rPr>
-        <w:lastRenderedPageBreak/>
         <w:t xml:space="preserve">In our design, inheritance represents the primary “is-a” relationships between classes.  Issue, Composite and </w:t>
       </w:r>
       <w:proofErr w:type="spellStart"/>
@@ -2604,7 +2633,16 @@
           <w:color w:val="000000" w:themeColor="text1"/>
           <w:lang w:val="en-US"/>
         </w:rPr>
-        <w:t xml:space="preserve">&lt;State&gt;.  Replacing the State automatically destroys the previous one, while invalid transitions are rejected by the current concrete State object. This keeps state-dependent logic out of the Issue class and avoids a large </w:t>
+        <w:t xml:space="preserve">&lt;State&gt;.  Replacing the State automatically destroys the previous one, while invalid transitions are </w:t>
+      </w:r>
+      <w:r>
+        <w:rPr>
+          <w:rFonts w:ascii="Arial" w:hAnsi="Arial" w:cs="Arial"/>
+          <w:color w:val="000000" w:themeColor="text1"/>
+          <w:lang w:val="en-US"/>
+        </w:rPr>
+        <w:lastRenderedPageBreak/>
+        <w:t xml:space="preserve">rejected by the current concrete State object. This keeps state-dependent logic out of the Issue class and avoids a large </w:t>
       </w:r>
       <w:proofErr w:type="spellStart"/>
       <w:r>
@@ -2656,7 +2694,6 @@
           <w:color w:val="000000" w:themeColor="text1"/>
           <w:lang w:val="en-US"/>
         </w:rPr>
-        <w:lastRenderedPageBreak/>
         <w:t>Iterators also use non-owning Component pointers.  When created, they build a snapshot of the traversal, ensuring that an existing traversal remains safe and predictable if the hierarchy is modified. A newly created iterator reflects the updated hierarchy.</w:t>
       </w:r>
       <w:r>
@@ -2741,6 +2778,7 @@
         <w:rPr>
           <w:rFonts w:ascii="Arial" w:hAnsi="Arial" w:cs="Arial"/>
           <w:color w:val="000000" w:themeColor="text1"/>
+          <w:u w:val="single"/>
           <w:lang w:val="en-US"/>
         </w:rPr>
       </w:pPr>
@@ -2748,6 +2786,7 @@
         <w:rPr>
           <w:rFonts w:ascii="Arial" w:hAnsi="Arial" w:cs="Arial"/>
           <w:color w:val="000000" w:themeColor="text1"/>
+          <w:u w:val="single"/>
           <w:lang w:val="en-US"/>
         </w:rPr>
         <w:t>Task4:</w:t>
@@ -2816,6 +2855,7 @@
         <w:rPr>
           <w:rFonts w:ascii="Arial" w:hAnsi="Arial" w:cs="Arial"/>
           <w:color w:val="000000" w:themeColor="text1"/>
+          <w:u w:val="single"/>
           <w:lang w:val="en-US"/>
         </w:rPr>
       </w:pPr>
@@ -2823,9 +2863,10 @@
         <w:rPr>
           <w:rFonts w:ascii="Arial" w:hAnsi="Arial" w:cs="Arial"/>
           <w:color w:val="000000" w:themeColor="text1"/>
-          <w:lang w:val="en-US"/>
-        </w:rPr>
-        <w:t>Attached separately</w:t>
+          <w:u w:val="single"/>
+          <w:lang w:val="en-US"/>
+        </w:rPr>
+        <w:t>Task 5:</w:t>
       </w:r>
     </w:p>
     <w:p>
@@ -2842,202 +2883,578 @@
           <w:color w:val="000000" w:themeColor="text1"/>
           <w:lang w:val="en-US"/>
         </w:rPr>
-        <w:t>Task 5:</w:t>
+        <w:t xml:space="preserve">During the development of </w:t>
+      </w:r>
+      <w:proofErr w:type="spellStart"/>
+      <w:r>
+        <w:rPr>
+          <w:rFonts w:ascii="Arial" w:hAnsi="Arial" w:cs="Arial"/>
+          <w:color w:val="000000" w:themeColor="text1"/>
+          <w:lang w:val="en-US"/>
+        </w:rPr>
+        <w:t>TaskForge</w:t>
+      </w:r>
+      <w:proofErr w:type="spellEnd"/>
+      <w:r>
+        <w:rPr>
+          <w:rFonts w:ascii="Arial" w:hAnsi="Arial" w:cs="Arial"/>
+          <w:color w:val="000000" w:themeColor="text1"/>
+          <w:lang w:val="en-US"/>
+        </w:rPr>
+        <w:t xml:space="preserve">, GDB was used to inspect runtime behaviour and diagnose pointer-related errors, while </w:t>
+      </w:r>
+      <w:proofErr w:type="spellStart"/>
+      <w:r>
+        <w:rPr>
+          <w:rFonts w:ascii="Arial" w:hAnsi="Arial" w:cs="Arial"/>
+          <w:color w:val="000000" w:themeColor="text1"/>
+          <w:lang w:val="en-US"/>
+        </w:rPr>
+        <w:t>Valgrind</w:t>
+      </w:r>
+      <w:proofErr w:type="spellEnd"/>
+      <w:r>
+        <w:rPr>
+          <w:rFonts w:ascii="Arial" w:hAnsi="Arial" w:cs="Arial"/>
+          <w:color w:val="000000" w:themeColor="text1"/>
+          <w:lang w:val="en-US"/>
+        </w:rPr>
+        <w:t xml:space="preserve"> was used to verify the final program's memory management. The program was compiled with debugging symbols using the -g compiler flag so that GDB could inspect source lines, variables and the call stack. A particularly important problem encountered during development involved null pointers in the Decorator implementation. GDB was used to inspect the pointer value and identify the attempted dereference of a null wrapped component. After correcting the error, defensive null checks and regression tests were added. Finally, the complete application was executed under </w:t>
+      </w:r>
+      <w:proofErr w:type="spellStart"/>
+      <w:r>
+        <w:rPr>
+          <w:rFonts w:ascii="Arial" w:hAnsi="Arial" w:cs="Arial"/>
+          <w:color w:val="000000" w:themeColor="text1"/>
+          <w:lang w:val="en-US"/>
+        </w:rPr>
+        <w:t>Valgrind</w:t>
+      </w:r>
+      <w:proofErr w:type="spellEnd"/>
+      <w:r>
+        <w:rPr>
+          <w:rFonts w:ascii="Arial" w:hAnsi="Arial" w:cs="Arial"/>
+          <w:color w:val="000000" w:themeColor="text1"/>
+          <w:lang w:val="en-US"/>
+        </w:rPr>
+        <w:t xml:space="preserve"> to verify that the</w:t>
+      </w:r>
+      <w:r>
+        <w:rPr>
+          <w:rFonts w:ascii="-webkit-standard" w:hAnsi="-webkit-standard"/>
+          <w:color w:val="FFFFFF"/>
+          <w:sz w:val="27"/>
+          <w:szCs w:val="27"/>
+        </w:rPr>
+        <w:t xml:space="preserve"> </w:t>
+      </w:r>
+      <w:r>
+        <w:rPr>
+          <w:rFonts w:ascii="Arial" w:hAnsi="Arial" w:cs="Arial"/>
+          <w:color w:val="000000" w:themeColor="text1"/>
+          <w:lang w:val="en-US"/>
+        </w:rPr>
+        <w:t>ownership model did not introduce memory leaks.</w:t>
       </w:r>
     </w:p>
     <w:p>
       <w:pPr>
-        <w:spacing w:after="0" w:line="240" w:lineRule="auto"/>
-        <w:rPr>
-          <w:rFonts w:ascii="Arial" w:eastAsia="Times New Roman" w:hAnsi="Arial" w:cs="Arial"/>
-          <w:color w:val="000000" w:themeColor="text1"/>
-          <w:kern w:val="0"/>
-          <w:sz w:val="16"/>
-          <w:szCs w:val="16"/>
-          <w:lang w:eastAsia="en-GB"/>
-          <w14:ligatures w14:val="none"/>
+        <w:rPr>
+          <w:rFonts w:ascii="Arial" w:hAnsi="Arial" w:cs="Arial"/>
+          <w:color w:val="000000" w:themeColor="text1"/>
+          <w:lang w:val="en-US"/>
         </w:rPr>
       </w:pPr>
       <w:r>
         <w:rPr>
-          <w:rFonts w:ascii="Arial" w:eastAsia="Times New Roman" w:hAnsi="Arial" w:cs="Arial"/>
-          <w:color w:val="000000" w:themeColor="text1"/>
-          <w:kern w:val="0"/>
-          <w:sz w:val="16"/>
-          <w:szCs w:val="16"/>
-          <w:lang w:eastAsia="en-GB"/>
-          <w14:ligatures w14:val="none"/>
-        </w:rPr>
-        <w:t>Your PDF must contain a short engineering investigation that includes:</w:t>
+          <w:rFonts w:ascii="Arial" w:hAnsi="Arial" w:cs="Arial"/>
+          <w:color w:val="000000" w:themeColor="text1"/>
+          <w:lang w:val="en-US"/>
+        </w:rPr>
+        <w:t>During development, a null-pointer error occurred when a Decorator existed without a valid wrapped Component. The Decorator implementation delegated operations such as getState(), getName() and getDescription() to wrappedComponent. If </w:t>
+      </w:r>
+      <w:proofErr w:type="spellStart"/>
+      <w:r>
+        <w:rPr>
+          <w:rFonts w:ascii="Arial" w:hAnsi="Arial" w:cs="Arial"/>
+          <w:color w:val="000000" w:themeColor="text1"/>
+          <w:lang w:val="en-US"/>
+        </w:rPr>
+        <w:t>wrappedComponent</w:t>
+      </w:r>
+      <w:proofErr w:type="spellEnd"/>
+      <w:r>
+        <w:rPr>
+          <w:rFonts w:ascii="Arial" w:hAnsi="Arial" w:cs="Arial"/>
+          <w:color w:val="000000" w:themeColor="text1"/>
+          <w:lang w:val="en-US"/>
+        </w:rPr>
+        <w:t> was </w:t>
+      </w:r>
+      <w:proofErr w:type="spellStart"/>
+      <w:r>
+        <w:rPr>
+          <w:rFonts w:ascii="Arial" w:hAnsi="Arial" w:cs="Arial"/>
+          <w:color w:val="000000" w:themeColor="text1"/>
+          <w:lang w:val="en-US"/>
+        </w:rPr>
+        <w:t>nullptr</w:t>
+      </w:r>
+      <w:proofErr w:type="spellEnd"/>
+      <w:r>
+        <w:rPr>
+          <w:rFonts w:ascii="Arial" w:hAnsi="Arial" w:cs="Arial"/>
+          <w:color w:val="000000" w:themeColor="text1"/>
+          <w:lang w:val="en-US"/>
+        </w:rPr>
+        <w:t>, attempting to call a method through it caused the program to terminate with a segmentation fault.</w:t>
       </w:r>
     </w:p>
     <w:p>
       <w:pPr>
-        <w:spacing w:after="0" w:line="240" w:lineRule="auto"/>
-        <w:rPr>
-          <w:rFonts w:ascii="Arial" w:eastAsia="Times New Roman" w:hAnsi="Arial" w:cs="Arial"/>
-          <w:color w:val="000000" w:themeColor="text1"/>
-          <w:kern w:val="0"/>
-          <w:sz w:val="17"/>
-          <w:szCs w:val="17"/>
-          <w:lang w:eastAsia="en-GB"/>
-          <w14:ligatures w14:val="none"/>
+        <w:rPr>
+          <w:rFonts w:ascii="Arial" w:hAnsi="Arial" w:cs="Arial"/>
+          <w:color w:val="000000" w:themeColor="text1"/>
+          <w:lang w:val="en-US"/>
         </w:rPr>
       </w:pPr>
       <w:r>
         <w:rPr>
-          <w:rFonts w:ascii="Arial" w:eastAsia="Times New Roman" w:hAnsi="Arial" w:cs="Arial"/>
-          <w:color w:val="000000" w:themeColor="text1"/>
-          <w:kern w:val="0"/>
-          <w:sz w:val="16"/>
-          <w:szCs w:val="16"/>
-          <w:lang w:eastAsia="en-GB"/>
-          <w14:ligatures w14:val="none"/>
-        </w:rPr>
-        <w:t xml:space="preserve">• </w:t>
-      </w:r>
-      <w:r>
-        <w:rPr>
-          <w:rFonts w:ascii="Arial" w:eastAsia="Times New Roman" w:hAnsi="Arial" w:cs="Arial"/>
-          <w:color w:val="000000" w:themeColor="text1"/>
-          <w:kern w:val="0"/>
-          <w:sz w:val="17"/>
-          <w:szCs w:val="17"/>
-          <w:lang w:eastAsia="en-GB"/>
-          <w14:ligatures w14:val="none"/>
-        </w:rPr>
-        <w:t>evidence of using GDB on a meaningful part of your program, including breakpoints/stepping and</w:t>
+          <w:rFonts w:ascii="Arial" w:hAnsi="Arial" w:cs="Arial"/>
+          <w:color w:val="000000" w:themeColor="text1"/>
+          <w:lang w:val="en-US"/>
+        </w:rPr>
+        <w:lastRenderedPageBreak/>
+        <w:t>Figure X: GDB evidence of the null-pointer defect. </w:t>
+      </w:r>
+      <w:proofErr w:type="spellStart"/>
+      <w:r>
+        <w:rPr>
+          <w:rFonts w:ascii="Arial" w:hAnsi="Arial" w:cs="Arial"/>
+          <w:color w:val="000000" w:themeColor="text1"/>
+          <w:lang w:val="en-US"/>
+        </w:rPr>
+        <w:t>wrappedComponent</w:t>
+      </w:r>
+      <w:proofErr w:type="spellEnd"/>
+      <w:r>
+        <w:rPr>
+          <w:rFonts w:ascii="Arial" w:hAnsi="Arial" w:cs="Arial"/>
+          <w:color w:val="000000" w:themeColor="text1"/>
+          <w:lang w:val="en-US"/>
+        </w:rPr>
+        <w:t> was inspected and found to contain 0x0. Execution subsequently attempted to access the wrapped object, causing SIGSEGV. The backtrace identified the Decorator implementation as the origin of the failure.</w:t>
       </w:r>
     </w:p>
     <w:p>
       <w:pPr>
-        <w:spacing w:after="0" w:line="240" w:lineRule="auto"/>
-        <w:rPr>
-          <w:rFonts w:ascii="Arial" w:eastAsia="Times New Roman" w:hAnsi="Arial" w:cs="Arial"/>
-          <w:color w:val="000000" w:themeColor="text1"/>
-          <w:kern w:val="0"/>
-          <w:sz w:val="16"/>
-          <w:szCs w:val="16"/>
-          <w:lang w:eastAsia="en-GB"/>
-          <w14:ligatures w14:val="none"/>
+        <w:rPr>
+          <w:rFonts w:ascii="Arial" w:hAnsi="Arial" w:cs="Arial"/>
+          <w:color w:val="000000" w:themeColor="text1"/>
+          <w:lang w:val="en-US"/>
         </w:rPr>
       </w:pPr>
       <w:r>
         <w:rPr>
-          <w:rFonts w:ascii="Arial" w:eastAsia="Times New Roman" w:hAnsi="Arial" w:cs="Arial"/>
-          <w:color w:val="000000" w:themeColor="text1"/>
-          <w:kern w:val="0"/>
-          <w:sz w:val="16"/>
-          <w:szCs w:val="16"/>
-          <w:lang w:eastAsia="en-GB"/>
-          <w14:ligatures w14:val="none"/>
-        </w:rPr>
-        <w:t>inspection of relevant program state;</w:t>
+          <w:rFonts w:ascii="Arial" w:hAnsi="Arial" w:cs="Arial"/>
+          <w:color w:val="000000" w:themeColor="text1"/>
+          <w:lang w:val="en-US"/>
+        </w:rPr>
+        <w:t>Cause: The Decorator stores a pointer to the Component that it wraps. The original implementation assumed that this pointer would always refer to a valid object and therefore delegated operations to it without first checking its value. When a null pointer was supplied, the Decorator attempted to access an object through address 0x0. GDB confirmed this by showing that the component/wrapped-component pointer was null immediately before the invalid access.</w:t>
       </w:r>
     </w:p>
     <w:p>
       <w:pPr>
-        <w:spacing w:after="0" w:line="240" w:lineRule="auto"/>
-        <w:rPr>
-          <w:rFonts w:ascii="Arial" w:eastAsia="Times New Roman" w:hAnsi="Arial" w:cs="Arial"/>
-          <w:color w:val="000000" w:themeColor="text1"/>
-          <w:kern w:val="0"/>
-          <w:sz w:val="16"/>
-          <w:szCs w:val="16"/>
-          <w:lang w:eastAsia="en-GB"/>
-          <w14:ligatures w14:val="none"/>
+        <w:rPr>
+          <w:rFonts w:ascii="Arial" w:hAnsi="Arial" w:cs="Arial"/>
+          <w:color w:val="000000" w:themeColor="text1"/>
+          <w:lang w:val="en-US"/>
         </w:rPr>
       </w:pPr>
       <w:r>
         <w:rPr>
-          <w:rFonts w:ascii="Arial" w:eastAsia="Times New Roman" w:hAnsi="Arial" w:cs="Arial"/>
-          <w:color w:val="000000" w:themeColor="text1"/>
-          <w:kern w:val="0"/>
-          <w:sz w:val="16"/>
-          <w:szCs w:val="16"/>
-          <w:lang w:eastAsia="en-GB"/>
-          <w14:ligatures w14:val="none"/>
-        </w:rPr>
-        <w:t>• one genuine bug encountered during development, with its symptom, cause, debugging evidence and</w:t>
+          <w:rFonts w:ascii="Arial" w:hAnsi="Arial" w:cs="Arial"/>
+          <w:color w:val="000000" w:themeColor="text1"/>
+          <w:lang w:val="en-US"/>
+        </w:rPr>
+        <w:t>Correction: Defensive checks were added before every operation that dereferences the wrapped Component. The Decorator constructor also uses conditional expressions when copying the Component's identifying information, allowing construction to remain safe even if a null pointer is supplied. Getter functions return a safe fallback value when no wrapped Component exists, while mutating operations simply do not delegate when the pointer is null. This removed the invalid dereference while maintaining normal Decorator behaviour when a valid Component is supplied.</w:t>
       </w:r>
     </w:p>
     <w:p>
       <w:pPr>
-        <w:spacing w:after="0" w:line="240" w:lineRule="auto"/>
-        <w:rPr>
-          <w:rFonts w:ascii="Arial" w:eastAsia="Times New Roman" w:hAnsi="Arial" w:cs="Arial"/>
-          <w:color w:val="000000" w:themeColor="text1"/>
-          <w:kern w:val="0"/>
-          <w:sz w:val="16"/>
-          <w:szCs w:val="16"/>
-          <w:lang w:eastAsia="en-GB"/>
-          <w14:ligatures w14:val="none"/>
+        <w:rPr>
+          <w:rFonts w:ascii="Arial" w:hAnsi="Arial" w:cs="Arial"/>
+          <w:color w:val="000000" w:themeColor="text1"/>
+          <w:lang w:val="en-US"/>
         </w:rPr>
       </w:pPr>
       <w:r>
         <w:rPr>
-          <w:rFonts w:ascii="Arial" w:eastAsia="Times New Roman" w:hAnsi="Arial" w:cs="Arial"/>
-          <w:color w:val="000000" w:themeColor="text1"/>
-          <w:kern w:val="0"/>
-          <w:sz w:val="16"/>
-          <w:szCs w:val="16"/>
-          <w:lang w:eastAsia="en-GB"/>
-          <w14:ligatures w14:val="none"/>
-        </w:rPr>
-        <w:t>correction; and</w:t>
+          <w:rFonts w:ascii="Arial" w:hAnsi="Arial" w:cs="Arial"/>
+          <w:color w:val="000000" w:themeColor="text1"/>
+          <w:lang w:val="en-US"/>
+        </w:rPr>
+        <w:t>After correcting the defect, a regression test was added to ensure that the same bug could not silently reappear. The test deliberately constructs </w:t>
+      </w:r>
+      <w:proofErr w:type="spellStart"/>
+      <w:r>
+        <w:rPr>
+          <w:rFonts w:ascii="Arial" w:hAnsi="Arial" w:cs="Arial"/>
+          <w:color w:val="000000" w:themeColor="text1"/>
+          <w:lang w:val="en-US"/>
+        </w:rPr>
+        <w:t>PriorityDecorator</w:t>
+      </w:r>
+      <w:proofErr w:type="spellEnd"/>
+      <w:r>
+        <w:rPr>
+          <w:rFonts w:ascii="Arial" w:hAnsi="Arial" w:cs="Arial"/>
+          <w:color w:val="000000" w:themeColor="text1"/>
+          <w:lang w:val="en-US"/>
+        </w:rPr>
+        <w:t> and TagDecorator objects with </w:t>
+      </w:r>
+      <w:proofErr w:type="spellStart"/>
+      <w:r>
+        <w:rPr>
+          <w:rFonts w:ascii="Arial" w:hAnsi="Arial" w:cs="Arial"/>
+          <w:color w:val="000000" w:themeColor="text1"/>
+          <w:lang w:val="en-US"/>
+        </w:rPr>
+        <w:t>nullptr</w:t>
+      </w:r>
+      <w:proofErr w:type="spellEnd"/>
+      <w:r>
+        <w:rPr>
+          <w:rFonts w:ascii="Arial" w:hAnsi="Arial" w:cs="Arial"/>
+          <w:color w:val="000000" w:themeColor="text1"/>
+          <w:lang w:val="en-US"/>
+        </w:rPr>
+        <w:t> wrapped Components and invokes their normal operations. The assertions verify that these operations return safe values rather than dereferencing the pointer. The test now executes successfully as part of the normal test suite.</w:t>
       </w:r>
     </w:p>
     <w:p>
       <w:pPr>
-        <w:spacing w:after="0" w:line="240" w:lineRule="auto"/>
-        <w:rPr>
-          <w:rFonts w:ascii="Arial" w:eastAsia="Times New Roman" w:hAnsi="Arial" w:cs="Arial"/>
-          <w:color w:val="000000" w:themeColor="text1"/>
-          <w:kern w:val="0"/>
-          <w:sz w:val="16"/>
-          <w:szCs w:val="16"/>
-          <w:lang w:eastAsia="en-GB"/>
-          <w14:ligatures w14:val="none"/>
+        <w:rPr>
+          <w:rFonts w:ascii="Arial" w:hAnsi="Arial" w:cs="Arial"/>
+          <w:color w:val="000000" w:themeColor="text1"/>
+          <w:lang w:val="en-US"/>
         </w:rPr>
       </w:pPr>
       <w:r>
         <w:rPr>
-          <w:rFonts w:ascii="Arial" w:eastAsia="Times New Roman" w:hAnsi="Arial" w:cs="Arial"/>
-          <w:color w:val="000000" w:themeColor="text1"/>
-          <w:kern w:val="0"/>
-          <w:sz w:val="16"/>
-          <w:szCs w:val="16"/>
-          <w:lang w:eastAsia="en-GB"/>
-          <w14:ligatures w14:val="none"/>
-        </w:rPr>
-        <w:t xml:space="preserve">• </w:t>
-      </w:r>
+          <w:rFonts w:ascii="Arial" w:hAnsi="Arial" w:cs="Arial"/>
+          <w:color w:val="000000" w:themeColor="text1"/>
+          <w:lang w:val="en-US"/>
+        </w:rPr>
+        <w:t>Following the null-pointer investigation, similar defensive checks were reviewed throughout the system. Registry operations now verify that requested identifiers exist before dereferencing the returned Component, decoration rejects null Decorators, and Composite operations ignore invalid null children. These checks reduce the possibility of another invalid-memory access entering the system through malformed runtime input.</w:t>
+      </w:r>
+    </w:p>
+    <w:p>
+      <w:pPr>
+        <w:rPr>
+          <w:rFonts w:ascii="Arial" w:hAnsi="Arial" w:cs="Arial"/>
+          <w:color w:val="000000" w:themeColor="text1"/>
+          <w:lang w:val="en-US"/>
+        </w:rPr>
+      </w:pPr>
       <w:proofErr w:type="spellStart"/>
       <w:r>
         <w:rPr>
-          <w:rFonts w:ascii="Arial" w:eastAsia="Times New Roman" w:hAnsi="Arial" w:cs="Arial"/>
-          <w:color w:val="000000" w:themeColor="text1"/>
-          <w:kern w:val="0"/>
-          <w:sz w:val="16"/>
-          <w:szCs w:val="16"/>
-          <w:lang w:eastAsia="en-GB"/>
-          <w14:ligatures w14:val="none"/>
+          <w:rFonts w:ascii="Arial" w:hAnsi="Arial" w:cs="Arial"/>
+          <w:color w:val="000000" w:themeColor="text1"/>
+          <w:lang w:val="en-US"/>
         </w:rPr>
         <w:t>Valgrind</w:t>
       </w:r>
       <w:proofErr w:type="spellEnd"/>
       <w:r>
         <w:rPr>
-          <w:rFonts w:ascii="Arial" w:eastAsia="Times New Roman" w:hAnsi="Arial" w:cs="Arial"/>
-          <w:color w:val="000000" w:themeColor="text1"/>
-          <w:kern w:val="0"/>
-          <w:sz w:val="16"/>
-          <w:szCs w:val="16"/>
-          <w:lang w:eastAsia="en-GB"/>
-          <w14:ligatures w14:val="none"/>
-        </w:rPr>
-        <w:t xml:space="preserve"> evidence for the final application.</w:t>
-      </w:r>
+          <w:rFonts w:ascii="Arial" w:hAnsi="Arial" w:cs="Arial"/>
+          <w:color w:val="000000" w:themeColor="text1"/>
+          <w:lang w:val="en-US"/>
+        </w:rPr>
+        <w:t xml:space="preserve"> results: The final </w:t>
+      </w:r>
+      <w:proofErr w:type="spellStart"/>
+      <w:r>
+        <w:rPr>
+          <w:rFonts w:ascii="Arial" w:hAnsi="Arial" w:cs="Arial"/>
+          <w:color w:val="000000" w:themeColor="text1"/>
+          <w:lang w:val="en-US"/>
+        </w:rPr>
+        <w:t>TaskForge</w:t>
+      </w:r>
+      <w:proofErr w:type="spellEnd"/>
+      <w:r>
+        <w:rPr>
+          <w:rFonts w:ascii="Arial" w:hAnsi="Arial" w:cs="Arial"/>
+          <w:color w:val="000000" w:themeColor="text1"/>
+          <w:lang w:val="en-US"/>
+        </w:rPr>
+        <w:t xml:space="preserve"> executable was run using </w:t>
+      </w:r>
+      <w:proofErr w:type="spellStart"/>
+      <w:r>
+        <w:rPr>
+          <w:rFonts w:ascii="Arial" w:hAnsi="Arial" w:cs="Arial"/>
+          <w:color w:val="000000" w:themeColor="text1"/>
+          <w:lang w:val="en-US"/>
+        </w:rPr>
+        <w:t>valgrind</w:t>
+      </w:r>
+      <w:proofErr w:type="spellEnd"/>
+      <w:r>
+        <w:rPr>
+          <w:rFonts w:ascii="Arial" w:hAnsi="Arial" w:cs="Arial"/>
+          <w:color w:val="000000" w:themeColor="text1"/>
+          <w:lang w:val="en-US"/>
+        </w:rPr>
+        <w:t xml:space="preserve"> --leak-check=full --show-leak-kinds=</w:t>
+      </w:r>
+      <w:proofErr w:type="gramStart"/>
+      <w:r>
+        <w:rPr>
+          <w:rFonts w:ascii="Arial" w:hAnsi="Arial" w:cs="Arial"/>
+          <w:color w:val="000000" w:themeColor="text1"/>
+          <w:lang w:val="en-US"/>
+        </w:rPr>
+        <w:t>all .</w:t>
+      </w:r>
+      <w:proofErr w:type="gramEnd"/>
+      <w:r>
+        <w:rPr>
+          <w:rFonts w:ascii="Arial" w:hAnsi="Arial" w:cs="Arial"/>
+          <w:color w:val="000000" w:themeColor="text1"/>
+          <w:lang w:val="en-US"/>
+        </w:rPr>
+        <w:t>/</w:t>
+      </w:r>
+      <w:proofErr w:type="spellStart"/>
+      <w:r>
+        <w:rPr>
+          <w:rFonts w:ascii="Arial" w:hAnsi="Arial" w:cs="Arial"/>
+          <w:color w:val="000000" w:themeColor="text1"/>
+          <w:lang w:val="en-US"/>
+        </w:rPr>
+        <w:t>taskforge</w:t>
+      </w:r>
+      <w:proofErr w:type="spellEnd"/>
+      <w:r>
+        <w:rPr>
+          <w:rFonts w:ascii="Arial" w:hAnsi="Arial" w:cs="Arial"/>
+          <w:color w:val="000000" w:themeColor="text1"/>
+          <w:lang w:val="en-US"/>
+        </w:rPr>
+        <w:t xml:space="preserve">. All major runtime scenarios were executed before normal program termination. The final </w:t>
+      </w:r>
+      <w:proofErr w:type="spellStart"/>
+      <w:r>
+        <w:rPr>
+          <w:rFonts w:ascii="Arial" w:hAnsi="Arial" w:cs="Arial"/>
+          <w:color w:val="000000" w:themeColor="text1"/>
+          <w:lang w:val="en-US"/>
+        </w:rPr>
+        <w:t>Valgrind</w:t>
+      </w:r>
+      <w:proofErr w:type="spellEnd"/>
+      <w:r>
+        <w:rPr>
+          <w:rFonts w:ascii="Arial" w:hAnsi="Arial" w:cs="Arial"/>
+          <w:color w:val="000000" w:themeColor="text1"/>
+          <w:lang w:val="en-US"/>
+        </w:rPr>
+        <w:t xml:space="preserve"> report showed 0 bytes </w:t>
+      </w:r>
+      <w:proofErr w:type="gramStart"/>
+      <w:r>
+        <w:rPr>
+          <w:rFonts w:ascii="Arial" w:hAnsi="Arial" w:cs="Arial"/>
+          <w:color w:val="000000" w:themeColor="text1"/>
+          <w:lang w:val="en-US"/>
+        </w:rPr>
+        <w:t>definitely lost</w:t>
+      </w:r>
+      <w:proofErr w:type="gramEnd"/>
+      <w:r>
+        <w:rPr>
+          <w:rFonts w:ascii="Arial" w:hAnsi="Arial" w:cs="Arial"/>
+          <w:color w:val="000000" w:themeColor="text1"/>
+          <w:lang w:val="en-US"/>
+        </w:rPr>
+        <w:t xml:space="preserve">, confirming that no definite memory leaks originated from the </w:t>
+      </w:r>
+      <w:proofErr w:type="spellStart"/>
+      <w:r>
+        <w:rPr>
+          <w:rFonts w:ascii="Arial" w:hAnsi="Arial" w:cs="Arial"/>
+          <w:color w:val="000000" w:themeColor="text1"/>
+          <w:lang w:val="en-US"/>
+        </w:rPr>
+        <w:t>TaskForge</w:t>
+      </w:r>
+      <w:proofErr w:type="spellEnd"/>
+      <w:r>
+        <w:rPr>
+          <w:rFonts w:ascii="Arial" w:hAnsi="Arial" w:cs="Arial"/>
+          <w:color w:val="000000" w:themeColor="text1"/>
+          <w:lang w:val="en-US"/>
+        </w:rPr>
+        <w:t xml:space="preserve"> implementation. This supports the ownership strategy used by the system, in which owning relationships use </w:t>
+      </w:r>
+      <w:proofErr w:type="gramStart"/>
+      <w:r>
+        <w:rPr>
+          <w:rFonts w:ascii="Arial" w:hAnsi="Arial" w:cs="Arial"/>
+          <w:color w:val="000000" w:themeColor="text1"/>
+          <w:lang w:val="en-US"/>
+        </w:rPr>
+        <w:t>std::</w:t>
+      </w:r>
+      <w:proofErr w:type="spellStart"/>
+      <w:proofErr w:type="gramEnd"/>
+      <w:r>
+        <w:rPr>
+          <w:rFonts w:ascii="Arial" w:hAnsi="Arial" w:cs="Arial"/>
+          <w:color w:val="000000" w:themeColor="text1"/>
+          <w:lang w:val="en-US"/>
+        </w:rPr>
+        <w:t>unique_ptr</w:t>
+      </w:r>
+      <w:proofErr w:type="spellEnd"/>
+      <w:r>
+        <w:rPr>
+          <w:rFonts w:ascii="Arial" w:hAnsi="Arial" w:cs="Arial"/>
+          <w:color w:val="000000" w:themeColor="text1"/>
+          <w:lang w:val="en-US"/>
+        </w:rPr>
+        <w:t> while Composite, Iterator and Decorator navigation relationships use non-owning pointers.</w:t>
+      </w:r>
+    </w:p>
+    <w:p>
+      <w:pPr>
+        <w:rPr>
+          <w:rFonts w:ascii="Arial" w:hAnsi="Arial" w:cs="Arial"/>
+          <w:color w:val="000000" w:themeColor="text1"/>
+          <w:lang w:val="en-US"/>
+        </w:rPr>
+      </w:pPr>
+      <w:r>
+        <w:rPr>
+          <w:rFonts w:ascii="Arial" w:hAnsi="Arial" w:cs="Arial"/>
+          <w:color w:val="000000" w:themeColor="text1"/>
+          <w:lang w:val="en-US"/>
+        </w:rPr>
+        <w:br w:type="page"/>
+      </w:r>
+    </w:p>
+    <w:p>
+      <w:pPr>
+        <w:rPr>
+          <w:rFonts w:ascii="Arial" w:hAnsi="Arial" w:cs="Arial"/>
+          <w:color w:val="000000" w:themeColor="text1"/>
+          <w:u w:val="single"/>
+          <w:lang w:val="en-US"/>
+        </w:rPr>
+      </w:pPr>
+      <w:r>
+        <w:rPr>
+          <w:rFonts w:ascii="Arial" w:hAnsi="Arial" w:cs="Arial"/>
+          <w:color w:val="000000" w:themeColor="text1"/>
+          <w:u w:val="single"/>
+          <w:lang w:val="en-US"/>
+        </w:rPr>
+        <w:lastRenderedPageBreak/>
+        <w:t>Task 6:</w:t>
+      </w:r>
+    </w:p>
+    <w:p>
+      <w:pPr>
+        <w:rPr>
+          <w:rFonts w:ascii="Arial" w:hAnsi="Arial" w:cs="Arial"/>
+          <w:color w:val="000000" w:themeColor="text1"/>
+          <w:lang w:val="en-US"/>
+        </w:rPr>
+      </w:pPr>
+      <w:proofErr w:type="spellStart"/>
+      <w:r>
+        <w:rPr>
+          <w:rFonts w:ascii="Arial" w:hAnsi="Arial" w:cs="Arial"/>
+          <w:color w:val="000000" w:themeColor="text1"/>
+          <w:lang w:val="en-US"/>
+        </w:rPr>
+        <w:t>TaskForge</w:t>
+      </w:r>
+      <w:proofErr w:type="spellEnd"/>
+      <w:r>
+        <w:rPr>
+          <w:rFonts w:ascii="Arial" w:hAnsi="Arial" w:cs="Arial"/>
+          <w:color w:val="000000" w:themeColor="text1"/>
+          <w:lang w:val="en-US"/>
+        </w:rPr>
+        <w:t xml:space="preserve"> development was divided equally among the three team members based on the system’s major areas. Ethan focused on implementing the Composite pattern, particularly the hierarchical relationship between repositories projects and issues. He also worked on the Docker environment and contributed to setting up and maintaining the GitHub repository. Michael tackled the Iterator pattern, including the necessary traversal </w:t>
+      </w:r>
+      <w:proofErr w:type="spellStart"/>
+      <w:r>
+        <w:rPr>
+          <w:rFonts w:ascii="Arial" w:hAnsi="Arial" w:cs="Arial"/>
+          <w:color w:val="000000" w:themeColor="text1"/>
+          <w:lang w:val="en-US"/>
+        </w:rPr>
+        <w:t>behaviour</w:t>
+      </w:r>
+      <w:proofErr w:type="spellEnd"/>
+      <w:r>
+        <w:rPr>
+          <w:rFonts w:ascii="Arial" w:hAnsi="Arial" w:cs="Arial"/>
+          <w:color w:val="000000" w:themeColor="text1"/>
+          <w:lang w:val="en-US"/>
+        </w:rPr>
+        <w:t>, and the Decorator pattern, which dynamically adds responsibilities like priority levels and tags to issues. Hannah handled the State pattern, encompassing the issue lifecycle and valid/invalid transitions.  She also prepared most of the documentation and UML diagrams needed for submission.</w:t>
+      </w:r>
+    </w:p>
+    <w:p>
+      <w:pPr>
+        <w:rPr>
+          <w:rFonts w:ascii="Arial" w:hAnsi="Arial" w:cs="Arial"/>
+          <w:color w:val="000000" w:themeColor="text1"/>
+          <w:lang w:val="en-US"/>
+        </w:rPr>
+      </w:pPr>
+      <w:r>
+        <w:rPr>
+          <w:rFonts w:ascii="Arial" w:hAnsi="Arial" w:cs="Arial"/>
+          <w:color w:val="000000" w:themeColor="text1"/>
+          <w:lang w:val="en-US"/>
+        </w:rPr>
+        <w:t>While each member had a primary responsibility, the work was integrated continuously rather than developed as isolated components.  The shared Component abstraction enabled the Composite Iterator State and Decorator implementations to interact within the system.  Team members regularly merged and tested each other’s work, resolving interface and integration issues and ensuring the combined application compiled and functioned correctly.  Finally, the main.cpp and demonstration scenarios tested how the four patterns collaborated within the GitHub-style project management domain.</w:t>
+      </w:r>
+    </w:p>
+    <w:p>
+      <w:pPr>
+        <w:rPr>
+          <w:rFonts w:ascii="Arial" w:hAnsi="Arial" w:cs="Arial"/>
+          <w:color w:val="000000" w:themeColor="text1"/>
+          <w:lang w:val="en-US"/>
+        </w:rPr>
+      </w:pPr>
+      <w:r>
+        <w:rPr>
+          <w:rFonts w:ascii="Arial" w:hAnsi="Arial" w:cs="Arial"/>
+          <w:color w:val="000000" w:themeColor="text1"/>
+          <w:lang w:val="en-US"/>
+        </w:rPr>
+        <w:t>Throughout development, GitHub served as the version control system and a record of collaboration.  Team members made commits as their features were implemented and updated, and the repository history documented contributions from all three.  Meaningful commits documented changes like implementing pattern classes, fixing integration errors, updating the Docker environment and completing the UML and documentation.  Before submission, replace the commit hashes pull requests or issue numbers below with those from the repository.</w:t>
+      </w:r>
+    </w:p>
+    <w:p>
+      <w:pPr>
+        <w:rPr>
+          <w:rFonts w:ascii="Arial" w:hAnsi="Arial" w:cs="Arial"/>
+          <w:color w:val="000000" w:themeColor="text1"/>
+          <w:lang w:val="en-US"/>
+        </w:rPr>
+      </w:pPr>
     </w:p>
     <w:p>
       <w:pPr>
@@ -3466,18 +3883,21 @@
     <w:link w:val="Heading1Char"/>
     <w:uiPriority w:val="9"/>
     <w:qFormat/>
-    <w:rsid w:val="00004E68"/>
+    <w:rsid w:val="000C4A57"/>
     <w:pPr>
       <w:keepNext/>
       <w:keepLines/>
       <w:spacing w:before="360" w:after="80"/>
+      <w:jc w:val="center"/>
       <w:outlineLvl w:val="0"/>
     </w:pPr>
     <w:rPr>
-      <w:rFonts w:asciiTheme="majorHAnsi" w:eastAsiaTheme="majorEastAsia" w:hAnsiTheme="majorHAnsi" w:cstheme="majorBidi"/>
-      <w:color w:val="0F4761" w:themeColor="accent1" w:themeShade="BF"/>
+      <w:rFonts w:ascii="Arial" w:eastAsiaTheme="majorEastAsia" w:hAnsi="Arial" w:cstheme="majorBidi"/>
+      <w:b/>
+      <w:color w:val="000000" w:themeColor="text1"/>
       <w:sz w:val="40"/>
       <w:szCs w:val="40"/>
+      <w:u w:val="single"/>
     </w:rPr>
   </w:style>
   <w:style w:type="paragraph" w:styleId="Heading2">
@@ -3690,12 +4110,14 @@
     <w:basedOn w:val="DefaultParagraphFont"/>
     <w:link w:val="Heading1"/>
     <w:uiPriority w:val="9"/>
-    <w:rsid w:val="00004E68"/>
+    <w:rsid w:val="000C4A57"/>
     <w:rPr>
-      <w:rFonts w:asciiTheme="majorHAnsi" w:eastAsiaTheme="majorEastAsia" w:hAnsiTheme="majorHAnsi" w:cstheme="majorBidi"/>
-      <w:color w:val="0F4761" w:themeColor="accent1" w:themeShade="BF"/>
+      <w:rFonts w:ascii="Arial" w:eastAsiaTheme="majorEastAsia" w:hAnsi="Arial" w:cstheme="majorBidi"/>
+      <w:b/>
+      <w:color w:val="000000" w:themeColor="text1"/>
       <w:sz w:val="40"/>
       <w:szCs w:val="40"/>
+      <w:u w:val="single"/>
     </w:rPr>
   </w:style>
   <w:style w:type="character" w:customStyle="1" w:styleId="Heading2Char">

</xml_diff>